<commit_message>
Show full HS codes in CO exports
</commit_message>
<xml_diff>
--- a/templates/CertificateOfOriginTemplate.docx
+++ b/templates/CertificateOfOriginTemplate.docx
@@ -483,7 +483,7 @@
           </w:p>
           <w:p>
             <w:pPr>
-              <w:spacing w:after="0"/>
+              <w:spacing w:after="0" w:before="40" w:line="240" w:lineRule="exact"/>
               <w:jc w:val="left"/>
             </w:pPr>
             <w:r>
@@ -504,6 +504,10 @@
               <w:bottom w:val="single" w:sz="4" w:space="0" w:color="auto"/>
               <w:right w:val="single" w:sz="4" w:space="0" w:color="auto"/>
             </w:tcBorders>
+            <w:tcMar>
+              <w:left w:w="40" w:type="dxa"/>
+              <w:right w:w="40" w:type="dxa"/>
+            </w:tcMar>
           </w:tcPr>
           <w:p>
             <w:pPr>
@@ -520,13 +524,14 @@
           </w:p>
           <w:p>
             <w:pPr>
-              <w:spacing w:after="0"/>
+              <w:spacing w:after="0" w:before="40" w:line="240" w:lineRule="exact"/>
               <w:jc w:val="center"/>
             </w:pPr>
             <w:r>
               <w:rPr>
                 <w:rFonts w:ascii="Times New Roman" w:hAnsi="Times New Roman"/>
-                <w:sz w:val="16"/>
+                <w:sz w:val="15"/>
+                <w:szCs w:val="15"/>
               </w:rPr>
               <w:t>{{CO_HS_CODES}}</w:t>
             </w:r>
@@ -557,7 +562,7 @@
           </w:p>
           <w:p>
             <w:pPr>
-              <w:spacing w:after="0"/>
+              <w:spacing w:after="0" w:before="40" w:line="240" w:lineRule="exact"/>
               <w:jc w:val="center"/>
             </w:pPr>
             <w:r>

</xml_diff>